<commit_message>
Update configuration and yasbella template
</commit_message>
<xml_diff>
--- a/yasbella.docx
+++ b/yasbella.docx
@@ -79,8 +79,6 @@
           <w:sz w:val="28"/>
         </w:rPr>
       </w:pPr>
-      <w:bookmarkStart w:id="0" w:name="_GoBack"/>
-      <w:bookmarkEnd w:id="0"/>
       <w:r>
         <w:rPr>
           <w:sz w:val="28"/>
@@ -601,6 +599,7 @@
           <w:sz w:val="22"/>
         </w:rPr>
       </w:pPr>
+      <w:bookmarkStart w:id="0" w:name="_GoBack"/>
       <w:r>
         <w:rPr>
           <w:sz w:val="28"/>
@@ -1132,6 +1131,7 @@
         <w:t xml:space="preserve">                                             </w:t>
       </w:r>
     </w:p>
+    <w:bookmarkEnd w:id="0"/>
     <w:p>
       <w:pPr>
         <w:jc w:val="right"/>

</xml_diff>